<commit_message>
ComplaintPulse: held-out unsupervised-topic result, N-ATLaS chain script
Co-Authored-By: Claude Opus 5.5 <noreply@anthropic.com>
</commit_message>
<xml_diff>
--- a/02-complaint-pulse/report/ComplaintPulse_Submission.docx
+++ b/02-complaint-pulse/report/ComplaintPulse_Submission.docx
@@ -1685,7 +1685,21 @@
         <w:rPr>
           <w:rFonts w:ascii="Arial" w:cs="Arial" w:eastAsia="Arial" w:hAnsi="Arial"/>
         </w:rPr>
-        <w:t xml:space="preserve"> (no labels at all): 7 of 8 incidents detected with correct cause and event, 1 false alarm. The miss is the smallest incident, a fraud campaign; see the language finding below.</w:t>
+        <w:t xml:space="preserve"> (no labels at all, topics discovered from embeddings): on the held-out stream </w:t>
+      </w:r>
+      <w:r>
+        <w:rPr>
+          <w:rFonts w:ascii="Arial" w:cs="Arial" w:eastAsia="Arial" w:hAnsi="Arial"/>
+          <w:b/>
+          <w:bCs/>
+        </w:rPr>
+        <w:t xml:space="preserve">8 of 8 incidents, 0 false alarms</w:t>
+      </w:r>
+      <w:r>
+        <w:rPr>
+          <w:rFonts w:ascii="Arial" w:cs="Arial" w:eastAsia="Arial" w:hAnsi="Arial"/>
+        </w:rPr>
+        <w:t xml:space="preserve">, root cause and event correct for all 8 (the daily-count rule on the same topics: 35 false alarms out of 57 alerts). On the main stream 7 of 8 with 1 false alarm; the miss is the smallest incident, a fraud campaign, which the language finding below explains.</w:t>
       </w:r>
     </w:p>
     <w:p>
@@ -3227,7 +3241,7 @@
         </w:rPr>
         <w:t xml:space="preserve">CBN complaints and fines 2024–2025: </w:t>
       </w:r>
-      <w:hyperlink w:history="1" r:id="rId744bxwudew-gqkhs9yejj">
+      <w:hyperlink w:history="1" r:id="rIdjlxwwdxxjtpe_5urjth4d">
         <w:r>
           <w:rPr>
             <w:rFonts w:ascii="Arial" w:cs="Arial" w:eastAsia="Arial" w:hAnsi="Arial"/>
@@ -3243,7 +3257,7 @@
         </w:rPr>
         <w:t xml:space="preserve">, </w:t>
       </w:r>
-      <w:hyperlink w:history="1" r:id="rIdwxzvw_iwikwgnqklftehr">
+      <w:hyperlink w:history="1" r:id="rIdk-8gpb9i4snx09w1pltvb">
         <w:r>
           <w:rPr>
             <w:rFonts w:ascii="Arial" w:cs="Arial" w:eastAsia="Arial" w:hAnsi="Arial"/>
@@ -3269,7 +3283,7 @@
         </w:rPr>
         <w:t xml:space="preserve">Failed-transaction refunds over 10 years: </w:t>
       </w:r>
-      <w:hyperlink w:history="1" r:id="rIdja_idh9qw3ikuyqunjetz">
+      <w:hyperlink w:history="1" r:id="rIdjkzpvtinwkdmhxlcr5rlz">
         <w:r>
           <w:rPr>
             <w:rFonts w:ascii="Arial" w:cs="Arial" w:eastAsia="Arial" w:hAnsi="Arial"/>
@@ -3295,7 +3309,7 @@
         </w:rPr>
         <w:t xml:space="preserve">N-ATLaS model card and terms: </w:t>
       </w:r>
-      <w:hyperlink w:history="1" r:id="rIdce0au8ragey_az6pbzmhs">
+      <w:hyperlink w:history="1" r:id="rIdbnr8rsyfmdez32zugipug">
         <w:r>
           <w:rPr>
             <w:rFonts w:ascii="Arial" w:cs="Arial" w:eastAsia="Arial" w:hAnsi="Arial"/>

</xml_diff>

<commit_message>
ComplaintPulse: N-ATLaS full-dataset results, language-independent topics, final report with console figures
Co-Authored-By: Claude Opus 5.5 <noreply@anthropic.com>
</commit_message>
<xml_diff>
--- a/02-complaint-pulse/report/ComplaintPulse_Submission.docx
+++ b/02-complaint-pulse/report/ComplaintPulse_Submission.docx
@@ -250,6 +250,8 @@
     </w:p>
     <w:p>
       <w:pPr>
+        <w:keepNext/>
+        <w:keepLines/>
         <w:spacing w:after="60" w:before="120"/>
         <w:jc w:val="center"/>
       </w:pPr>
@@ -598,7 +600,7 @@
         <w:rPr>
           <w:rFonts w:ascii="Arial" w:cs="Arial" w:eastAsia="Arial" w:hAnsi="Arial"/>
         </w:rPr>
-        <w:t xml:space="preserve"> For each incident, N-ATLaS writes a brief for the owning team from the evidence only, citing complaint IDs; a validator rejects any citation not in the evidence. It also drafts a proactive message to affected customers </w:t>
+        <w:t xml:space="preserve"> For each incident, N-ATLaS writes a brief for the owning team from the evidence only. A verifier checks </w:t>
       </w:r>
       <w:r>
         <w:rPr>
@@ -606,13 +608,27 @@
           <w:b/>
           <w:bCs/>
         </w:rPr>
-        <w:t xml:space="preserve">in Hausa, Pidgin, Yoruba, Igbo or English</w:t>
-      </w:r>
-      <w:r>
-        <w:rPr>
-          <w:rFonts w:ascii="Arial" w:cs="Arial" w:eastAsia="Arial" w:hAnsi="Arial"/>
-        </w:rPr>
-        <w:t xml:space="preserve">.</w:t>
+        <w:t xml:space="preserve">every number and complaint ID in the brief against the evidence</w:t>
+      </w:r>
+      <w:r>
+        <w:rPr>
+          <w:rFonts w:ascii="Arial" w:cs="Arial" w:eastAsia="Arial" w:hAnsi="Arial"/>
+        </w:rPr>
+        <w:t xml:space="preserve">; errors are sent back to the model for correction, and a brief that still fails is held for analyst review instead of being sent. N-ATLaS also drafts a proactive message to affected customers </w:t>
+      </w:r>
+      <w:r>
+        <w:rPr>
+          <w:rFonts w:ascii="Arial" w:cs="Arial" w:eastAsia="Arial" w:hAnsi="Arial"/>
+          <w:b/>
+          <w:bCs/>
+        </w:rPr>
+        <w:t xml:space="preserve">in Hausa, Yoruba, Igbo or English</w:t>
+      </w:r>
+      <w:r>
+        <w:rPr>
+          <w:rFonts w:ascii="Arial" w:cs="Arial" w:eastAsia="Arial" w:hAnsi="Arial"/>
+        </w:rPr>
+        <w:t xml:space="preserve">; every message is approved by a person before it goes out.</w:t>
       </w:r>
     </w:p>
     <w:p>
@@ -1555,6 +1571,8 @@
     </w:p>
     <w:p>
       <w:pPr>
+        <w:keepNext/>
+        <w:keepLines/>
         <w:spacing w:after="60" w:before="120"/>
         <w:jc w:val="center"/>
       </w:pPr>
@@ -1685,7 +1703,7 @@
         <w:rPr>
           <w:rFonts w:ascii="Arial" w:cs="Arial" w:eastAsia="Arial" w:hAnsi="Arial"/>
         </w:rPr>
-        <w:t xml:space="preserve"> (no labels at all, topics discovered from embeddings): on the held-out stream </w:t>
+        <w:t xml:space="preserve"> (no labels used anywhere; topics discovered from N-ATLaS's English summaries of each complaint): </w:t>
       </w:r>
       <w:r>
         <w:rPr>
@@ -1693,13 +1711,13 @@
           <w:b/>
           <w:bCs/>
         </w:rPr>
-        <w:t xml:space="preserve">8 of 8 incidents, 0 false alarms</w:t>
-      </w:r>
-      <w:r>
-        <w:rPr>
-          <w:rFonts w:ascii="Arial" w:cs="Arial" w:eastAsia="Arial" w:hAnsi="Arial"/>
-        </w:rPr>
-        <w:t xml:space="preserve">, root cause and event correct for all 8 (the daily-count rule on the same topics: 35 false alarms out of 57 alerts). On the main stream 7 of 8 with 1 false alarm; the miss is the smallest incident, a fraud campaign, which the language finding below explains.</w:t>
+        <w:t xml:space="preserve">8 of 8 incidents, 0 false alarms, root cause and event correct for all 8</w:t>
+      </w:r>
+      <w:r>
+        <w:rPr>
+          <w:rFonts w:ascii="Arial" w:cs="Arial" w:eastAsia="Arial" w:hAnsi="Arial"/>
+        </w:rPr>
+        <w:t xml:space="preserve">, median 5.5 h to alert; the daily-count rule on the same topics raises 21 false alarms out of 33 alerts. Topics discovered from raw multilingual text also caught 8 of 8 on the held-out stream but missed the fraud campaign on the main stream, for the reason below.</w:t>
       </w:r>
     </w:p>
     <w:p>
@@ -2391,6 +2409,8 @@
     </w:p>
     <w:p>
       <w:pPr>
+        <w:keepNext/>
+        <w:keepLines/>
         <w:spacing w:after="60" w:before="120"/>
         <w:jc w:val="center"/>
       </w:pPr>
@@ -2473,13 +2493,670 @@
           <w:b/>
           <w:bCs/>
         </w:rPr>
-        <w:t xml:space="preserve">Inclusion finding.</w:t>
-      </w:r>
-      <w:r>
-        <w:rPr>
-          <w:rFonts w:ascii="Arial" w:cs="Arial" w:eastAsia="Arial" w:hAnsi="Arial"/>
-        </w:rPr>
-        <w:t xml:space="preserve"> Multilingual embeddings alone group complaints by language as well as by problem: only 17–37% of Hausa, Pidgin, Igbo and Yoruba complaints landed in the same topic as English complaints about the same problem. That silently splits local-language customers' signal. Normalising each complaint with N-ATLaS first fixes this: (pending).</w:t>
+        <w:t xml:space="preserve">Inclusion finding: N-ATLaS is what makes local-language customers count.</w:t>
+      </w:r>
+      <w:r>
+        <w:rPr>
+          <w:rFonts w:ascii="Arial" w:cs="Arial" w:eastAsia="Arial" w:hAnsi="Arial"/>
+        </w:rPr>
+        <w:t xml:space="preserve"> Grouping complaints by their raw text, even with a strong multilingual embedding model, groups them by </w:t>
+      </w:r>
+      <w:r>
+        <w:rPr>
+          <w:rFonts w:ascii="Arial" w:cs="Arial" w:eastAsia="Arial" w:hAnsi="Arial"/>
+          <w:i/>
+          <w:iCs/>
+        </w:rPr>
+        <w:t xml:space="preserve">language</w:t>
+      </w:r>
+      <w:r>
+        <w:rPr>
+          <w:rFonts w:ascii="Arial" w:cs="Arial" w:eastAsia="Arial" w:hAnsi="Arial"/>
+        </w:rPr>
+        <w:t xml:space="preserve"> as much as by </w:t>
+      </w:r>
+      <w:r>
+        <w:rPr>
+          <w:rFonts w:ascii="Arial" w:cs="Arial" w:eastAsia="Arial" w:hAnsi="Arial"/>
+          <w:i/>
+          <w:iCs/>
+        </w:rPr>
+        <w:t xml:space="preserve">problem</w:t>
+      </w:r>
+      <w:r>
+        <w:rPr>
+          <w:rFonts w:ascii="Arial" w:cs="Arial" w:eastAsia="Arial" w:hAnsi="Arial"/>
+        </w:rPr>
+        <w:t xml:space="preserve">: only 18–37% of Pidgin, Hausa, Yoruba and Igbo complaints joined the topic where English complaints about the same problem sat, so a local-language customer's complaint was split off into a small topic of its own and could not raise an alarm. Having N-ATLaS first restate each complaint as a short English summary fixes this:</w:t>
+      </w:r>
+    </w:p>
+    <w:tbl>
+      <w:tblPr>
+        <w:tblW w:type="dxa" w:w="9638"/>
+        <w:tblBorders>
+          <w:top w:val="single" w:color="auto" w:sz="4"/>
+          <w:left w:val="single" w:color="auto" w:sz="4"/>
+          <w:bottom w:val="single" w:color="auto" w:sz="4"/>
+          <w:right w:val="single" w:color="auto" w:sz="4"/>
+          <w:insideH w:val="single" w:color="auto" w:sz="4"/>
+          <w:insideV w:val="single" w:color="auto" w:sz="4"/>
+        </w:tblBorders>
+      </w:tblPr>
+      <w:tblGrid>
+        <w:gridCol w:w="1652"/>
+        <w:gridCol w:w="3763"/>
+        <w:gridCol w:w="4223"/>
+      </w:tblGrid>
+      <w:tr>
+        <w:trPr>
+          <w:tblHeader/>
+        </w:trPr>
+        <w:tc>
+          <w:tcPr>
+            <w:tcW w:type="dxa" w:w="1652"/>
+            <w:tcBorders>
+              <w:top w:val="single" w:color="D9DDE8" w:sz="4"/>
+              <w:left w:val="single" w:color="D9DDE8" w:sz="4"/>
+              <w:bottom w:val="single" w:color="D9DDE8" w:sz="4"/>
+              <w:right w:val="single" w:color="D9DDE8" w:sz="4"/>
+            </w:tcBorders>
+            <w:shd w:fill="121827" w:color="auto" w:val="clear"/>
+            <w:tcMar>
+              <w:top w:type="dxa" w:w="60"/>
+              <w:left w:type="dxa" w:w="100"/>
+              <w:bottom w:type="dxa" w:w="60"/>
+              <w:right w:type="dxa" w:w="100"/>
+            </w:tcMar>
+          </w:tcPr>
+          <w:p>
+            <w:pPr>
+              <w:spacing w:after="0" w:line="252"/>
+            </w:pPr>
+            <w:r>
+              <w:rPr>
+                <w:rFonts w:ascii="Arial" w:cs="Arial" w:eastAsia="Arial" w:hAnsi="Arial"/>
+                <w:b/>
+                <w:bCs/>
+                <w:color w:val="FFFFFF"/>
+                <w:sz w:val="18"/>
+                <w:szCs w:val="18"/>
+              </w:rPr>
+              <w:t xml:space="preserve">Language</w:t>
+            </w:r>
+          </w:p>
+        </w:tc>
+        <w:tc>
+          <w:tcPr>
+            <w:tcW w:type="dxa" w:w="3763"/>
+            <w:tcBorders>
+              <w:top w:val="single" w:color="D9DDE8" w:sz="4"/>
+              <w:left w:val="single" w:color="D9DDE8" w:sz="4"/>
+              <w:bottom w:val="single" w:color="D9DDE8" w:sz="4"/>
+              <w:right w:val="single" w:color="D9DDE8" w:sz="4"/>
+            </w:tcBorders>
+            <w:shd w:fill="121827" w:color="auto" w:val="clear"/>
+            <w:tcMar>
+              <w:top w:type="dxa" w:w="60"/>
+              <w:left w:type="dxa" w:w="100"/>
+              <w:bottom w:type="dxa" w:w="60"/>
+              <w:right w:type="dxa" w:w="100"/>
+            </w:tcMar>
+          </w:tcPr>
+          <w:p>
+            <w:pPr>
+              <w:spacing w:after="0" w:line="252"/>
+            </w:pPr>
+            <w:r>
+              <w:rPr>
+                <w:rFonts w:ascii="Arial" w:cs="Arial" w:eastAsia="Arial" w:hAnsi="Arial"/>
+                <w:b/>
+                <w:bCs/>
+                <w:color w:val="FFFFFF"/>
+                <w:sz w:val="18"/>
+                <w:szCs w:val="18"/>
+              </w:rPr>
+              <w:t xml:space="preserve">Joins the right topic, raw text</w:t>
+            </w:r>
+          </w:p>
+        </w:tc>
+        <w:tc>
+          <w:tcPr>
+            <w:tcW w:type="dxa" w:w="4223"/>
+            <w:tcBorders>
+              <w:top w:val="single" w:color="D9DDE8" w:sz="4"/>
+              <w:left w:val="single" w:color="D9DDE8" w:sz="4"/>
+              <w:bottom w:val="single" w:color="D9DDE8" w:sz="4"/>
+              <w:right w:val="single" w:color="D9DDE8" w:sz="4"/>
+            </w:tcBorders>
+            <w:shd w:fill="121827" w:color="auto" w:val="clear"/>
+            <w:tcMar>
+              <w:top w:type="dxa" w:w="60"/>
+              <w:left w:type="dxa" w:w="100"/>
+              <w:bottom w:type="dxa" w:w="60"/>
+              <w:right w:type="dxa" w:w="100"/>
+            </w:tcMar>
+          </w:tcPr>
+          <w:p>
+            <w:pPr>
+              <w:spacing w:after="0" w:line="252"/>
+            </w:pPr>
+            <w:r>
+              <w:rPr>
+                <w:rFonts w:ascii="Arial" w:cs="Arial" w:eastAsia="Arial" w:hAnsi="Arial"/>
+                <w:b/>
+                <w:bCs/>
+                <w:color w:val="FFFFFF"/>
+                <w:sz w:val="18"/>
+                <w:szCs w:val="18"/>
+              </w:rPr>
+              <w:t xml:space="preserve">Joins the right topic, after N-ATLaS</w:t>
+            </w:r>
+          </w:p>
+        </w:tc>
+      </w:tr>
+      <w:tr>
+        <w:trPr>
+          <w:tblHeader w:val="off"/>
+        </w:trPr>
+        <w:tc>
+          <w:tcPr>
+            <w:tcW w:type="dxa" w:w="1652"/>
+            <w:tcBorders>
+              <w:top w:val="single" w:color="D9DDE8" w:sz="4"/>
+              <w:left w:val="single" w:color="D9DDE8" w:sz="4"/>
+              <w:bottom w:val="single" w:color="D9DDE8" w:sz="4"/>
+              <w:right w:val="single" w:color="D9DDE8" w:sz="4"/>
+            </w:tcBorders>
+            <w:shd w:fill="F1F2F7" w:color="auto" w:val="clear"/>
+            <w:tcMar>
+              <w:top w:type="dxa" w:w="60"/>
+              <w:left w:type="dxa" w:w="100"/>
+              <w:bottom w:type="dxa" w:w="60"/>
+              <w:right w:type="dxa" w:w="100"/>
+            </w:tcMar>
+          </w:tcPr>
+          <w:p>
+            <w:pPr>
+              <w:spacing w:after="0" w:line="252"/>
+            </w:pPr>
+            <w:r>
+              <w:rPr>
+                <w:rFonts w:ascii="Arial" w:cs="Arial" w:eastAsia="Arial" w:hAnsi="Arial"/>
+                <w:sz w:val="18"/>
+                <w:szCs w:val="18"/>
+              </w:rPr>
+              <w:t xml:space="preserve">Pidgin</w:t>
+            </w:r>
+          </w:p>
+        </w:tc>
+        <w:tc>
+          <w:tcPr>
+            <w:tcW w:type="dxa" w:w="3763"/>
+            <w:tcBorders>
+              <w:top w:val="single" w:color="D9DDE8" w:sz="4"/>
+              <w:left w:val="single" w:color="D9DDE8" w:sz="4"/>
+              <w:bottom w:val="single" w:color="D9DDE8" w:sz="4"/>
+              <w:right w:val="single" w:color="D9DDE8" w:sz="4"/>
+            </w:tcBorders>
+            <w:tcMar>
+              <w:top w:type="dxa" w:w="60"/>
+              <w:left w:type="dxa" w:w="100"/>
+              <w:bottom w:type="dxa" w:w="60"/>
+              <w:right w:type="dxa" w:w="100"/>
+            </w:tcMar>
+          </w:tcPr>
+          <w:p>
+            <w:pPr>
+              <w:spacing w:after="0" w:line="252"/>
+            </w:pPr>
+            <w:r>
+              <w:rPr>
+                <w:rFonts w:ascii="Arial" w:cs="Arial" w:eastAsia="Arial" w:hAnsi="Arial"/>
+                <w:sz w:val="18"/>
+                <w:szCs w:val="18"/>
+              </w:rPr>
+              <w:t xml:space="preserve">33%</w:t>
+            </w:r>
+          </w:p>
+        </w:tc>
+        <w:tc>
+          <w:tcPr>
+            <w:tcW w:type="dxa" w:w="4223"/>
+            <w:tcBorders>
+              <w:top w:val="single" w:color="D9DDE8" w:sz="4"/>
+              <w:left w:val="single" w:color="D9DDE8" w:sz="4"/>
+              <w:bottom w:val="single" w:color="D9DDE8" w:sz="4"/>
+              <w:right w:val="single" w:color="D9DDE8" w:sz="4"/>
+            </w:tcBorders>
+            <w:tcMar>
+              <w:top w:type="dxa" w:w="60"/>
+              <w:left w:type="dxa" w:w="100"/>
+              <w:bottom w:type="dxa" w:w="60"/>
+              <w:right w:type="dxa" w:w="100"/>
+            </w:tcMar>
+          </w:tcPr>
+          <w:p>
+            <w:pPr>
+              <w:spacing w:after="0" w:line="252"/>
+            </w:pPr>
+            <w:r>
+              <w:rPr>
+                <w:rFonts w:ascii="Arial" w:cs="Arial" w:eastAsia="Arial" w:hAnsi="Arial"/>
+                <w:b/>
+                <w:bCs/>
+                <w:sz w:val="18"/>
+                <w:szCs w:val="18"/>
+              </w:rPr>
+              <w:t xml:space="preserve">86%</w:t>
+            </w:r>
+          </w:p>
+        </w:tc>
+      </w:tr>
+      <w:tr>
+        <w:trPr>
+          <w:tblHeader w:val="off"/>
+        </w:trPr>
+        <w:tc>
+          <w:tcPr>
+            <w:tcW w:type="dxa" w:w="1652"/>
+            <w:tcBorders>
+              <w:top w:val="single" w:color="D9DDE8" w:sz="4"/>
+              <w:left w:val="single" w:color="D9DDE8" w:sz="4"/>
+              <w:bottom w:val="single" w:color="D9DDE8" w:sz="4"/>
+              <w:right w:val="single" w:color="D9DDE8" w:sz="4"/>
+            </w:tcBorders>
+            <w:shd w:fill="F1F2F7" w:color="auto" w:val="clear"/>
+            <w:tcMar>
+              <w:top w:type="dxa" w:w="60"/>
+              <w:left w:type="dxa" w:w="100"/>
+              <w:bottom w:type="dxa" w:w="60"/>
+              <w:right w:type="dxa" w:w="100"/>
+            </w:tcMar>
+          </w:tcPr>
+          <w:p>
+            <w:pPr>
+              <w:spacing w:after="0" w:line="252"/>
+            </w:pPr>
+            <w:r>
+              <w:rPr>
+                <w:rFonts w:ascii="Arial" w:cs="Arial" w:eastAsia="Arial" w:hAnsi="Arial"/>
+                <w:sz w:val="18"/>
+                <w:szCs w:val="18"/>
+              </w:rPr>
+              <w:t xml:space="preserve">Hausa</w:t>
+            </w:r>
+          </w:p>
+        </w:tc>
+        <w:tc>
+          <w:tcPr>
+            <w:tcW w:type="dxa" w:w="3763"/>
+            <w:tcBorders>
+              <w:top w:val="single" w:color="D9DDE8" w:sz="4"/>
+              <w:left w:val="single" w:color="D9DDE8" w:sz="4"/>
+              <w:bottom w:val="single" w:color="D9DDE8" w:sz="4"/>
+              <w:right w:val="single" w:color="D9DDE8" w:sz="4"/>
+            </w:tcBorders>
+            <w:tcMar>
+              <w:top w:type="dxa" w:w="60"/>
+              <w:left w:type="dxa" w:w="100"/>
+              <w:bottom w:type="dxa" w:w="60"/>
+              <w:right w:type="dxa" w:w="100"/>
+            </w:tcMar>
+          </w:tcPr>
+          <w:p>
+            <w:pPr>
+              <w:spacing w:after="0" w:line="252"/>
+            </w:pPr>
+            <w:r>
+              <w:rPr>
+                <w:rFonts w:ascii="Arial" w:cs="Arial" w:eastAsia="Arial" w:hAnsi="Arial"/>
+                <w:sz w:val="18"/>
+                <w:szCs w:val="18"/>
+              </w:rPr>
+              <w:t xml:space="preserve">37%</w:t>
+            </w:r>
+          </w:p>
+        </w:tc>
+        <w:tc>
+          <w:tcPr>
+            <w:tcW w:type="dxa" w:w="4223"/>
+            <w:tcBorders>
+              <w:top w:val="single" w:color="D9DDE8" w:sz="4"/>
+              <w:left w:val="single" w:color="D9DDE8" w:sz="4"/>
+              <w:bottom w:val="single" w:color="D9DDE8" w:sz="4"/>
+              <w:right w:val="single" w:color="D9DDE8" w:sz="4"/>
+            </w:tcBorders>
+            <w:tcMar>
+              <w:top w:type="dxa" w:w="60"/>
+              <w:left w:type="dxa" w:w="100"/>
+              <w:bottom w:type="dxa" w:w="60"/>
+              <w:right w:type="dxa" w:w="100"/>
+            </w:tcMar>
+          </w:tcPr>
+          <w:p>
+            <w:pPr>
+              <w:spacing w:after="0" w:line="252"/>
+            </w:pPr>
+            <w:r>
+              <w:rPr>
+                <w:rFonts w:ascii="Arial" w:cs="Arial" w:eastAsia="Arial" w:hAnsi="Arial"/>
+                <w:b/>
+                <w:bCs/>
+                <w:sz w:val="18"/>
+                <w:szCs w:val="18"/>
+              </w:rPr>
+              <w:t xml:space="preserve">77%</w:t>
+            </w:r>
+          </w:p>
+        </w:tc>
+      </w:tr>
+      <w:tr>
+        <w:trPr>
+          <w:tblHeader w:val="off"/>
+        </w:trPr>
+        <w:tc>
+          <w:tcPr>
+            <w:tcW w:type="dxa" w:w="1652"/>
+            <w:tcBorders>
+              <w:top w:val="single" w:color="D9DDE8" w:sz="4"/>
+              <w:left w:val="single" w:color="D9DDE8" w:sz="4"/>
+              <w:bottom w:val="single" w:color="D9DDE8" w:sz="4"/>
+              <w:right w:val="single" w:color="D9DDE8" w:sz="4"/>
+            </w:tcBorders>
+            <w:shd w:fill="F1F2F7" w:color="auto" w:val="clear"/>
+            <w:tcMar>
+              <w:top w:type="dxa" w:w="60"/>
+              <w:left w:type="dxa" w:w="100"/>
+              <w:bottom w:type="dxa" w:w="60"/>
+              <w:right w:type="dxa" w:w="100"/>
+            </w:tcMar>
+          </w:tcPr>
+          <w:p>
+            <w:pPr>
+              <w:spacing w:after="0" w:line="252"/>
+            </w:pPr>
+            <w:r>
+              <w:rPr>
+                <w:rFonts w:ascii="Arial" w:cs="Arial" w:eastAsia="Arial" w:hAnsi="Arial"/>
+                <w:sz w:val="18"/>
+                <w:szCs w:val="18"/>
+              </w:rPr>
+              <w:t xml:space="preserve">Yoruba</w:t>
+            </w:r>
+          </w:p>
+        </w:tc>
+        <w:tc>
+          <w:tcPr>
+            <w:tcW w:type="dxa" w:w="3763"/>
+            <w:tcBorders>
+              <w:top w:val="single" w:color="D9DDE8" w:sz="4"/>
+              <w:left w:val="single" w:color="D9DDE8" w:sz="4"/>
+              <w:bottom w:val="single" w:color="D9DDE8" w:sz="4"/>
+              <w:right w:val="single" w:color="D9DDE8" w:sz="4"/>
+            </w:tcBorders>
+            <w:tcMar>
+              <w:top w:type="dxa" w:w="60"/>
+              <w:left w:type="dxa" w:w="100"/>
+              <w:bottom w:type="dxa" w:w="60"/>
+              <w:right w:type="dxa" w:w="100"/>
+            </w:tcMar>
+          </w:tcPr>
+          <w:p>
+            <w:pPr>
+              <w:spacing w:after="0" w:line="252"/>
+            </w:pPr>
+            <w:r>
+              <w:rPr>
+                <w:rFonts w:ascii="Arial" w:cs="Arial" w:eastAsia="Arial" w:hAnsi="Arial"/>
+                <w:sz w:val="18"/>
+                <w:szCs w:val="18"/>
+              </w:rPr>
+              <w:t xml:space="preserve">18%</w:t>
+            </w:r>
+          </w:p>
+        </w:tc>
+        <w:tc>
+          <w:tcPr>
+            <w:tcW w:type="dxa" w:w="4223"/>
+            <w:tcBorders>
+              <w:top w:val="single" w:color="D9DDE8" w:sz="4"/>
+              <w:left w:val="single" w:color="D9DDE8" w:sz="4"/>
+              <w:bottom w:val="single" w:color="D9DDE8" w:sz="4"/>
+              <w:right w:val="single" w:color="D9DDE8" w:sz="4"/>
+            </w:tcBorders>
+            <w:tcMar>
+              <w:top w:type="dxa" w:w="60"/>
+              <w:left w:type="dxa" w:w="100"/>
+              <w:bottom w:type="dxa" w:w="60"/>
+              <w:right w:type="dxa" w:w="100"/>
+            </w:tcMar>
+          </w:tcPr>
+          <w:p>
+            <w:pPr>
+              <w:spacing w:after="0" w:line="252"/>
+            </w:pPr>
+            <w:r>
+              <w:rPr>
+                <w:rFonts w:ascii="Arial" w:cs="Arial" w:eastAsia="Arial" w:hAnsi="Arial"/>
+                <w:b/>
+                <w:bCs/>
+                <w:sz w:val="18"/>
+                <w:szCs w:val="18"/>
+              </w:rPr>
+              <w:t xml:space="preserve">78%</w:t>
+            </w:r>
+          </w:p>
+        </w:tc>
+      </w:tr>
+      <w:tr>
+        <w:trPr>
+          <w:tblHeader w:val="off"/>
+        </w:trPr>
+        <w:tc>
+          <w:tcPr>
+            <w:tcW w:type="dxa" w:w="1652"/>
+            <w:tcBorders>
+              <w:top w:val="single" w:color="D9DDE8" w:sz="4"/>
+              <w:left w:val="single" w:color="D9DDE8" w:sz="4"/>
+              <w:bottom w:val="single" w:color="D9DDE8" w:sz="4"/>
+              <w:right w:val="single" w:color="D9DDE8" w:sz="4"/>
+            </w:tcBorders>
+            <w:shd w:fill="F1F2F7" w:color="auto" w:val="clear"/>
+            <w:tcMar>
+              <w:top w:type="dxa" w:w="60"/>
+              <w:left w:type="dxa" w:w="100"/>
+              <w:bottom w:type="dxa" w:w="60"/>
+              <w:right w:type="dxa" w:w="100"/>
+            </w:tcMar>
+          </w:tcPr>
+          <w:p>
+            <w:pPr>
+              <w:spacing w:after="0" w:line="252"/>
+            </w:pPr>
+            <w:r>
+              <w:rPr>
+                <w:rFonts w:ascii="Arial" w:cs="Arial" w:eastAsia="Arial" w:hAnsi="Arial"/>
+                <w:sz w:val="18"/>
+                <w:szCs w:val="18"/>
+              </w:rPr>
+              <w:t xml:space="preserve">Igbo</w:t>
+            </w:r>
+          </w:p>
+        </w:tc>
+        <w:tc>
+          <w:tcPr>
+            <w:tcW w:type="dxa" w:w="3763"/>
+            <w:tcBorders>
+              <w:top w:val="single" w:color="D9DDE8" w:sz="4"/>
+              <w:left w:val="single" w:color="D9DDE8" w:sz="4"/>
+              <w:bottom w:val="single" w:color="D9DDE8" w:sz="4"/>
+              <w:right w:val="single" w:color="D9DDE8" w:sz="4"/>
+            </w:tcBorders>
+            <w:tcMar>
+              <w:top w:type="dxa" w:w="60"/>
+              <w:left w:type="dxa" w:w="100"/>
+              <w:bottom w:type="dxa" w:w="60"/>
+              <w:right w:type="dxa" w:w="100"/>
+            </w:tcMar>
+          </w:tcPr>
+          <w:p>
+            <w:pPr>
+              <w:spacing w:after="0" w:line="252"/>
+            </w:pPr>
+            <w:r>
+              <w:rPr>
+                <w:rFonts w:ascii="Arial" w:cs="Arial" w:eastAsia="Arial" w:hAnsi="Arial"/>
+                <w:sz w:val="18"/>
+                <w:szCs w:val="18"/>
+              </w:rPr>
+              <w:t xml:space="preserve">24%</w:t>
+            </w:r>
+          </w:p>
+        </w:tc>
+        <w:tc>
+          <w:tcPr>
+            <w:tcW w:type="dxa" w:w="4223"/>
+            <w:tcBorders>
+              <w:top w:val="single" w:color="D9DDE8" w:sz="4"/>
+              <w:left w:val="single" w:color="D9DDE8" w:sz="4"/>
+              <w:bottom w:val="single" w:color="D9DDE8" w:sz="4"/>
+              <w:right w:val="single" w:color="D9DDE8" w:sz="4"/>
+            </w:tcBorders>
+            <w:tcMar>
+              <w:top w:type="dxa" w:w="60"/>
+              <w:left w:type="dxa" w:w="100"/>
+              <w:bottom w:type="dxa" w:w="60"/>
+              <w:right w:type="dxa" w:w="100"/>
+            </w:tcMar>
+          </w:tcPr>
+          <w:p>
+            <w:pPr>
+              <w:spacing w:after="0" w:line="252"/>
+            </w:pPr>
+            <w:r>
+              <w:rPr>
+                <w:rFonts w:ascii="Arial" w:cs="Arial" w:eastAsia="Arial" w:hAnsi="Arial"/>
+                <w:b/>
+                <w:bCs/>
+                <w:sz w:val="18"/>
+                <w:szCs w:val="18"/>
+              </w:rPr>
+              <w:t xml:space="preserve">71%</w:t>
+            </w:r>
+          </w:p>
+        </w:tc>
+      </w:tr>
+      <w:tr>
+        <w:trPr>
+          <w:tblHeader w:val="off"/>
+        </w:trPr>
+        <w:tc>
+          <w:tcPr>
+            <w:tcW w:type="dxa" w:w="1652"/>
+            <w:tcBorders>
+              <w:top w:val="single" w:color="D9DDE8" w:sz="4"/>
+              <w:left w:val="single" w:color="D9DDE8" w:sz="4"/>
+              <w:bottom w:val="single" w:color="D9DDE8" w:sz="4"/>
+              <w:right w:val="single" w:color="D9DDE8" w:sz="4"/>
+            </w:tcBorders>
+            <w:shd w:fill="F1F2F7" w:color="auto" w:val="clear"/>
+            <w:tcMar>
+              <w:top w:type="dxa" w:w="60"/>
+              <w:left w:type="dxa" w:w="100"/>
+              <w:bottom w:type="dxa" w:w="60"/>
+              <w:right w:type="dxa" w:w="100"/>
+            </w:tcMar>
+          </w:tcPr>
+          <w:p>
+            <w:pPr>
+              <w:spacing w:after="0" w:line="252"/>
+            </w:pPr>
+            <w:r>
+              <w:rPr>
+                <w:rFonts w:ascii="Arial" w:cs="Arial" w:eastAsia="Arial" w:hAnsi="Arial"/>
+                <w:sz w:val="18"/>
+                <w:szCs w:val="18"/>
+              </w:rPr>
+              <w:t xml:space="preserve">English</w:t>
+            </w:r>
+          </w:p>
+        </w:tc>
+        <w:tc>
+          <w:tcPr>
+            <w:tcW w:type="dxa" w:w="3763"/>
+            <w:tcBorders>
+              <w:top w:val="single" w:color="D9DDE8" w:sz="4"/>
+              <w:left w:val="single" w:color="D9DDE8" w:sz="4"/>
+              <w:bottom w:val="single" w:color="D9DDE8" w:sz="4"/>
+              <w:right w:val="single" w:color="D9DDE8" w:sz="4"/>
+            </w:tcBorders>
+            <w:tcMar>
+              <w:top w:type="dxa" w:w="60"/>
+              <w:left w:type="dxa" w:w="100"/>
+              <w:bottom w:type="dxa" w:w="60"/>
+              <w:right w:type="dxa" w:w="100"/>
+            </w:tcMar>
+          </w:tcPr>
+          <w:p>
+            <w:pPr>
+              <w:spacing w:after="0" w:line="252"/>
+            </w:pPr>
+            <w:r>
+              <w:rPr>
+                <w:rFonts w:ascii="Arial" w:cs="Arial" w:eastAsia="Arial" w:hAnsi="Arial"/>
+                <w:sz w:val="18"/>
+                <w:szCs w:val="18"/>
+              </w:rPr>
+              <w:t xml:space="preserve">97%</w:t>
+            </w:r>
+          </w:p>
+        </w:tc>
+        <w:tc>
+          <w:tcPr>
+            <w:tcW w:type="dxa" w:w="4223"/>
+            <w:tcBorders>
+              <w:top w:val="single" w:color="D9DDE8" w:sz="4"/>
+              <w:left w:val="single" w:color="D9DDE8" w:sz="4"/>
+              <w:bottom w:val="single" w:color="D9DDE8" w:sz="4"/>
+              <w:right w:val="single" w:color="D9DDE8" w:sz="4"/>
+            </w:tcBorders>
+            <w:tcMar>
+              <w:top w:type="dxa" w:w="60"/>
+              <w:left w:type="dxa" w:w="100"/>
+              <w:bottom w:type="dxa" w:w="60"/>
+              <w:right w:type="dxa" w:w="100"/>
+            </w:tcMar>
+          </w:tcPr>
+          <w:p>
+            <w:pPr>
+              <w:spacing w:after="0" w:line="252"/>
+            </w:pPr>
+            <w:r>
+              <w:rPr>
+                <w:rFonts w:ascii="Arial" w:cs="Arial" w:eastAsia="Arial" w:hAnsi="Arial"/>
+                <w:sz w:val="18"/>
+                <w:szCs w:val="18"/>
+              </w:rPr>
+              <w:t xml:space="preserve">91%</w:t>
+            </w:r>
+          </w:p>
+        </w:tc>
+      </w:tr>
+    </w:tbl>
+    <w:p>
+      <w:pPr>
+        <w:spacing w:after="120"/>
+      </w:pPr>
+    </w:p>
+    <w:p>
+      <w:pPr>
+        <w:spacing w:after="120" w:line="288"/>
+      </w:pPr>
+      <w:r>
+        <w:rPr>
+          <w:rFonts w:ascii="Arial" w:cs="Arial" w:eastAsia="Arial" w:hAnsi="Arial"/>
+        </w:rPr>
+        <w:t xml:space="preserve">Topic purity rose from 0.89 to 0.96 (NMI 0.81 → 0.90), and the fraud campaign, whose complaints had been split by language, is now detected.</w:t>
       </w:r>
     </w:p>
     <w:p>
@@ -2492,13 +3169,1039 @@
           <w:b/>
           <w:bCs/>
         </w:rPr>
-        <w:t xml:space="preserve">N-ATLaS understanding, per language:</w:t>
-      </w:r>
-      <w:r>
-        <w:rPr>
-          <w:rFonts w:ascii="Arial" w:cs="Arial" w:eastAsia="Arial" w:hAnsi="Arial"/>
-        </w:rPr>
-        <w:t xml:space="preserve"> (N-ATLaS evaluation pending)</w:t>
+        <w:t xml:space="preserve">N-ATLaS understanding, per language</w:t>
+      </w:r>
+      <w:r>
+        <w:rPr>
+          <w:rFonts w:ascii="Arial" w:cs="Arial" w:eastAsia="Arial" w:hAnsi="Arial"/>
+        </w:rPr>
+        <w:t xml:space="preserve"> (issue classified correctly, on the A100):</w:t>
+      </w:r>
+    </w:p>
+    <w:tbl>
+      <w:tblPr>
+        <w:tblW w:type="dxa" w:w="9638"/>
+        <w:tblBorders>
+          <w:top w:val="single" w:color="auto" w:sz="4"/>
+          <w:left w:val="single" w:color="auto" w:sz="4"/>
+          <w:bottom w:val="single" w:color="auto" w:sz="4"/>
+          <w:right w:val="single" w:color="auto" w:sz="4"/>
+          <w:insideH w:val="single" w:color="auto" w:sz="4"/>
+          <w:insideV w:val="single" w:color="auto" w:sz="4"/>
+        </w:tblBorders>
+      </w:tblPr>
+      <w:tblGrid>
+        <w:gridCol w:w="1528"/>
+        <w:gridCol w:w="2060"/>
+        <w:gridCol w:w="3190"/>
+        <w:gridCol w:w="2860"/>
+      </w:tblGrid>
+      <w:tr>
+        <w:trPr>
+          <w:tblHeader/>
+        </w:trPr>
+        <w:tc>
+          <w:tcPr>
+            <w:tcW w:type="dxa" w:w="1528"/>
+            <w:tcBorders>
+              <w:top w:val="single" w:color="D9DDE8" w:sz="4"/>
+              <w:left w:val="single" w:color="D9DDE8" w:sz="4"/>
+              <w:bottom w:val="single" w:color="D9DDE8" w:sz="4"/>
+              <w:right w:val="single" w:color="D9DDE8" w:sz="4"/>
+            </w:tcBorders>
+            <w:shd w:fill="121827" w:color="auto" w:val="clear"/>
+            <w:tcMar>
+              <w:top w:type="dxa" w:w="60"/>
+              <w:left w:type="dxa" w:w="100"/>
+              <w:bottom w:type="dxa" w:w="60"/>
+              <w:right w:type="dxa" w:w="100"/>
+            </w:tcMar>
+          </w:tcPr>
+          <w:p>
+            <w:pPr>
+              <w:spacing w:after="0" w:line="252"/>
+            </w:pPr>
+            <w:r>
+              <w:rPr>
+                <w:rFonts w:ascii="Arial" w:cs="Arial" w:eastAsia="Arial" w:hAnsi="Arial"/>
+                <w:b/>
+                <w:bCs/>
+                <w:color w:val="FFFFFF"/>
+                <w:sz w:val="18"/>
+                <w:szCs w:val="18"/>
+              </w:rPr>
+              <w:t xml:space="preserve">Language</w:t>
+            </w:r>
+          </w:p>
+        </w:tc>
+        <w:tc>
+          <w:tcPr>
+            <w:tcW w:type="dxa" w:w="2060"/>
+            <w:tcBorders>
+              <w:top w:val="single" w:color="D9DDE8" w:sz="4"/>
+              <w:left w:val="single" w:color="D9DDE8" w:sz="4"/>
+              <w:bottom w:val="single" w:color="D9DDE8" w:sz="4"/>
+              <w:right w:val="single" w:color="D9DDE8" w:sz="4"/>
+            </w:tcBorders>
+            <w:shd w:fill="121827" w:color="auto" w:val="clear"/>
+            <w:tcMar>
+              <w:top w:type="dxa" w:w="60"/>
+              <w:left w:type="dxa" w:w="100"/>
+              <w:bottom w:type="dxa" w:w="60"/>
+              <w:right w:type="dxa" w:w="100"/>
+            </w:tcMar>
+          </w:tcPr>
+          <w:p>
+            <w:pPr>
+              <w:spacing w:after="0" w:line="252"/>
+            </w:pPr>
+            <w:r>
+              <w:rPr>
+                <w:rFonts w:ascii="Arial" w:cs="Arial" w:eastAsia="Arial" w:hAnsi="Arial"/>
+                <w:b/>
+                <w:bCs/>
+                <w:color w:val="FFFFFF"/>
+                <w:sz w:val="18"/>
+                <w:szCs w:val="18"/>
+              </w:rPr>
+              <w:t xml:space="preserve">Bank-style complaints</w:t>
+            </w:r>
+          </w:p>
+        </w:tc>
+        <w:tc>
+          <w:tcPr>
+            <w:tcW w:type="dxa" w:w="3190"/>
+            <w:tcBorders>
+              <w:top w:val="single" w:color="D9DDE8" w:sz="4"/>
+              <w:left w:val="single" w:color="D9DDE8" w:sz="4"/>
+              <w:bottom w:val="single" w:color="D9DDE8" w:sz="4"/>
+              <w:right w:val="single" w:color="D9DDE8" w:sz="4"/>
+            </w:tcBorders>
+            <w:shd w:fill="121827" w:color="auto" w:val="clear"/>
+            <w:tcMar>
+              <w:top w:type="dxa" w:w="60"/>
+              <w:left w:type="dxa" w:w="100"/>
+              <w:bottom w:type="dxa" w:w="60"/>
+              <w:right w:type="dxa" w:w="100"/>
+            </w:tcMar>
+          </w:tcPr>
+          <w:p>
+            <w:pPr>
+              <w:spacing w:after="0" w:line="252"/>
+            </w:pPr>
+            <w:r>
+              <w:rPr>
+                <w:rFonts w:ascii="Arial" w:cs="Arial" w:eastAsia="Arial" w:hAnsi="Arial"/>
+                <w:b/>
+                <w:bCs/>
+                <w:color w:val="FFFFFF"/>
+                <w:sz w:val="18"/>
+                <w:szCs w:val="18"/>
+              </w:rPr>
+              <w:t xml:space="preserve">Complaints freely rewritten by N-ATLaS</w:t>
+            </w:r>
+          </w:p>
+        </w:tc>
+        <w:tc>
+          <w:tcPr>
+            <w:tcW w:type="dxa" w:w="2860"/>
+            <w:tcBorders>
+              <w:top w:val="single" w:color="D9DDE8" w:sz="4"/>
+              <w:left w:val="single" w:color="D9DDE8" w:sz="4"/>
+              <w:bottom w:val="single" w:color="D9DDE8" w:sz="4"/>
+              <w:right w:val="single" w:color="D9DDE8" w:sz="4"/>
+            </w:tcBorders>
+            <w:shd w:fill="121827" w:color="auto" w:val="clear"/>
+            <w:tcMar>
+              <w:top w:type="dxa" w:w="60"/>
+              <w:left w:type="dxa" w:w="100"/>
+              <w:bottom w:type="dxa" w:w="60"/>
+              <w:right w:type="dxa" w:w="100"/>
+            </w:tcMar>
+          </w:tcPr>
+          <w:p>
+            <w:pPr>
+              <w:spacing w:after="0" w:line="252"/>
+            </w:pPr>
+            <w:r>
+              <w:rPr>
+                <w:rFonts w:ascii="Arial" w:cs="Arial" w:eastAsia="Arial" w:hAnsi="Arial"/>
+                <w:b/>
+                <w:bCs/>
+                <w:color w:val="FFFFFF"/>
+                <w:sz w:val="18"/>
+                <w:szCs w:val="18"/>
+              </w:rPr>
+              <w:t xml:space="preserve">All 249,553 complaints (macro-F1)</w:t>
+            </w:r>
+          </w:p>
+        </w:tc>
+      </w:tr>
+      <w:tr>
+        <w:trPr>
+          <w:tblHeader w:val="off"/>
+        </w:trPr>
+        <w:tc>
+          <w:tcPr>
+            <w:tcW w:type="dxa" w:w="1528"/>
+            <w:tcBorders>
+              <w:top w:val="single" w:color="D9DDE8" w:sz="4"/>
+              <w:left w:val="single" w:color="D9DDE8" w:sz="4"/>
+              <w:bottom w:val="single" w:color="D9DDE8" w:sz="4"/>
+              <w:right w:val="single" w:color="D9DDE8" w:sz="4"/>
+            </w:tcBorders>
+            <w:shd w:fill="F1F2F7" w:color="auto" w:val="clear"/>
+            <w:tcMar>
+              <w:top w:type="dxa" w:w="60"/>
+              <w:left w:type="dxa" w:w="100"/>
+              <w:bottom w:type="dxa" w:w="60"/>
+              <w:right w:type="dxa" w:w="100"/>
+            </w:tcMar>
+          </w:tcPr>
+          <w:p>
+            <w:pPr>
+              <w:spacing w:after="0" w:line="252"/>
+            </w:pPr>
+            <w:r>
+              <w:rPr>
+                <w:rFonts w:ascii="Arial" w:cs="Arial" w:eastAsia="Arial" w:hAnsi="Arial"/>
+                <w:sz w:val="18"/>
+                <w:szCs w:val="18"/>
+              </w:rPr>
+              <w:t xml:space="preserve">English</w:t>
+            </w:r>
+          </w:p>
+        </w:tc>
+        <w:tc>
+          <w:tcPr>
+            <w:tcW w:type="dxa" w:w="2060"/>
+            <w:tcBorders>
+              <w:top w:val="single" w:color="D9DDE8" w:sz="4"/>
+              <w:left w:val="single" w:color="D9DDE8" w:sz="4"/>
+              <w:bottom w:val="single" w:color="D9DDE8" w:sz="4"/>
+              <w:right w:val="single" w:color="D9DDE8" w:sz="4"/>
+            </w:tcBorders>
+            <w:tcMar>
+              <w:top w:type="dxa" w:w="60"/>
+              <w:left w:type="dxa" w:w="100"/>
+              <w:bottom w:type="dxa" w:w="60"/>
+              <w:right w:type="dxa" w:w="100"/>
+            </w:tcMar>
+          </w:tcPr>
+          <w:p>
+            <w:pPr>
+              <w:spacing w:after="0" w:line="252"/>
+            </w:pPr>
+            <w:r>
+              <w:rPr>
+                <w:rFonts w:ascii="Arial" w:cs="Arial" w:eastAsia="Arial" w:hAnsi="Arial"/>
+                <w:sz w:val="18"/>
+                <w:szCs w:val="18"/>
+              </w:rPr>
+              <w:t xml:space="preserve">95%</w:t>
+            </w:r>
+          </w:p>
+        </w:tc>
+        <w:tc>
+          <w:tcPr>
+            <w:tcW w:type="dxa" w:w="3190"/>
+            <w:tcBorders>
+              <w:top w:val="single" w:color="D9DDE8" w:sz="4"/>
+              <w:left w:val="single" w:color="D9DDE8" w:sz="4"/>
+              <w:bottom w:val="single" w:color="D9DDE8" w:sz="4"/>
+              <w:right w:val="single" w:color="D9DDE8" w:sz="4"/>
+            </w:tcBorders>
+            <w:tcMar>
+              <w:top w:type="dxa" w:w="60"/>
+              <w:left w:type="dxa" w:w="100"/>
+              <w:bottom w:type="dxa" w:w="60"/>
+              <w:right w:type="dxa" w:w="100"/>
+            </w:tcMar>
+          </w:tcPr>
+          <w:p>
+            <w:pPr>
+              <w:spacing w:after="0" w:line="252"/>
+            </w:pPr>
+            <w:r>
+              <w:rPr>
+                <w:rFonts w:ascii="Arial" w:cs="Arial" w:eastAsia="Arial" w:hAnsi="Arial"/>
+                <w:sz w:val="18"/>
+                <w:szCs w:val="18"/>
+              </w:rPr>
+              <w:t xml:space="preserve">83%</w:t>
+            </w:r>
+          </w:p>
+        </w:tc>
+        <w:tc>
+          <w:tcPr>
+            <w:tcW w:type="dxa" w:w="2860"/>
+            <w:tcBorders>
+              <w:top w:val="single" w:color="D9DDE8" w:sz="4"/>
+              <w:left w:val="single" w:color="D9DDE8" w:sz="4"/>
+              <w:bottom w:val="single" w:color="D9DDE8" w:sz="4"/>
+              <w:right w:val="single" w:color="D9DDE8" w:sz="4"/>
+            </w:tcBorders>
+            <w:tcMar>
+              <w:top w:type="dxa" w:w="60"/>
+              <w:left w:type="dxa" w:w="100"/>
+              <w:bottom w:type="dxa" w:w="60"/>
+              <w:right w:type="dxa" w:w="100"/>
+            </w:tcMar>
+          </w:tcPr>
+          <w:p>
+            <w:pPr>
+              <w:spacing w:after="0" w:line="252"/>
+            </w:pPr>
+            <w:r>
+              <w:rPr>
+                <w:rFonts w:ascii="Arial" w:cs="Arial" w:eastAsia="Arial" w:hAnsi="Arial"/>
+                <w:sz w:val="18"/>
+                <w:szCs w:val="18"/>
+              </w:rPr>
+              <w:t xml:space="preserve">97% (97%)</w:t>
+            </w:r>
+          </w:p>
+        </w:tc>
+      </w:tr>
+      <w:tr>
+        <w:trPr>
+          <w:tblHeader w:val="off"/>
+        </w:trPr>
+        <w:tc>
+          <w:tcPr>
+            <w:tcW w:type="dxa" w:w="1528"/>
+            <w:tcBorders>
+              <w:top w:val="single" w:color="D9DDE8" w:sz="4"/>
+              <w:left w:val="single" w:color="D9DDE8" w:sz="4"/>
+              <w:bottom w:val="single" w:color="D9DDE8" w:sz="4"/>
+              <w:right w:val="single" w:color="D9DDE8" w:sz="4"/>
+            </w:tcBorders>
+            <w:shd w:fill="F1F2F7" w:color="auto" w:val="clear"/>
+            <w:tcMar>
+              <w:top w:type="dxa" w:w="60"/>
+              <w:left w:type="dxa" w:w="100"/>
+              <w:bottom w:type="dxa" w:w="60"/>
+              <w:right w:type="dxa" w:w="100"/>
+            </w:tcMar>
+          </w:tcPr>
+          <w:p>
+            <w:pPr>
+              <w:spacing w:after="0" w:line="252"/>
+            </w:pPr>
+            <w:r>
+              <w:rPr>
+                <w:rFonts w:ascii="Arial" w:cs="Arial" w:eastAsia="Arial" w:hAnsi="Arial"/>
+                <w:sz w:val="18"/>
+                <w:szCs w:val="18"/>
+              </w:rPr>
+              <w:t xml:space="preserve">Pidgin</w:t>
+            </w:r>
+          </w:p>
+        </w:tc>
+        <w:tc>
+          <w:tcPr>
+            <w:tcW w:type="dxa" w:w="2060"/>
+            <w:tcBorders>
+              <w:top w:val="single" w:color="D9DDE8" w:sz="4"/>
+              <w:left w:val="single" w:color="D9DDE8" w:sz="4"/>
+              <w:bottom w:val="single" w:color="D9DDE8" w:sz="4"/>
+              <w:right w:val="single" w:color="D9DDE8" w:sz="4"/>
+            </w:tcBorders>
+            <w:tcMar>
+              <w:top w:type="dxa" w:w="60"/>
+              <w:left w:type="dxa" w:w="100"/>
+              <w:bottom w:type="dxa" w:w="60"/>
+              <w:right w:type="dxa" w:w="100"/>
+            </w:tcMar>
+          </w:tcPr>
+          <w:p>
+            <w:pPr>
+              <w:spacing w:after="0" w:line="252"/>
+            </w:pPr>
+            <w:r>
+              <w:rPr>
+                <w:rFonts w:ascii="Arial" w:cs="Arial" w:eastAsia="Arial" w:hAnsi="Arial"/>
+                <w:sz w:val="18"/>
+                <w:szCs w:val="18"/>
+              </w:rPr>
+              <w:t xml:space="preserve">92%</w:t>
+            </w:r>
+          </w:p>
+        </w:tc>
+        <w:tc>
+          <w:tcPr>
+            <w:tcW w:type="dxa" w:w="3190"/>
+            <w:tcBorders>
+              <w:top w:val="single" w:color="D9DDE8" w:sz="4"/>
+              <w:left w:val="single" w:color="D9DDE8" w:sz="4"/>
+              <w:bottom w:val="single" w:color="D9DDE8" w:sz="4"/>
+              <w:right w:val="single" w:color="D9DDE8" w:sz="4"/>
+            </w:tcBorders>
+            <w:tcMar>
+              <w:top w:type="dxa" w:w="60"/>
+              <w:left w:type="dxa" w:w="100"/>
+              <w:bottom w:type="dxa" w:w="60"/>
+              <w:right w:type="dxa" w:w="100"/>
+            </w:tcMar>
+          </w:tcPr>
+          <w:p>
+            <w:pPr>
+              <w:spacing w:after="0" w:line="252"/>
+            </w:pPr>
+            <w:r>
+              <w:rPr>
+                <w:rFonts w:ascii="Arial" w:cs="Arial" w:eastAsia="Arial" w:hAnsi="Arial"/>
+                <w:sz w:val="18"/>
+                <w:szCs w:val="18"/>
+              </w:rPr>
+              <w:t xml:space="preserve">73%</w:t>
+            </w:r>
+          </w:p>
+        </w:tc>
+        <w:tc>
+          <w:tcPr>
+            <w:tcW w:type="dxa" w:w="2860"/>
+            <w:tcBorders>
+              <w:top w:val="single" w:color="D9DDE8" w:sz="4"/>
+              <w:left w:val="single" w:color="D9DDE8" w:sz="4"/>
+              <w:bottom w:val="single" w:color="D9DDE8" w:sz="4"/>
+              <w:right w:val="single" w:color="D9DDE8" w:sz="4"/>
+            </w:tcBorders>
+            <w:tcMar>
+              <w:top w:type="dxa" w:w="60"/>
+              <w:left w:type="dxa" w:w="100"/>
+              <w:bottom w:type="dxa" w:w="60"/>
+              <w:right w:type="dxa" w:w="100"/>
+            </w:tcMar>
+          </w:tcPr>
+          <w:p>
+            <w:pPr>
+              <w:spacing w:after="0" w:line="252"/>
+            </w:pPr>
+            <w:r>
+              <w:rPr>
+                <w:rFonts w:ascii="Arial" w:cs="Arial" w:eastAsia="Arial" w:hAnsi="Arial"/>
+                <w:sz w:val="18"/>
+                <w:szCs w:val="18"/>
+              </w:rPr>
+              <w:t xml:space="preserve">89% (84%)</w:t>
+            </w:r>
+          </w:p>
+        </w:tc>
+      </w:tr>
+      <w:tr>
+        <w:trPr>
+          <w:tblHeader w:val="off"/>
+        </w:trPr>
+        <w:tc>
+          <w:tcPr>
+            <w:tcW w:type="dxa" w:w="1528"/>
+            <w:tcBorders>
+              <w:top w:val="single" w:color="D9DDE8" w:sz="4"/>
+              <w:left w:val="single" w:color="D9DDE8" w:sz="4"/>
+              <w:bottom w:val="single" w:color="D9DDE8" w:sz="4"/>
+              <w:right w:val="single" w:color="D9DDE8" w:sz="4"/>
+            </w:tcBorders>
+            <w:shd w:fill="F1F2F7" w:color="auto" w:val="clear"/>
+            <w:tcMar>
+              <w:top w:type="dxa" w:w="60"/>
+              <w:left w:type="dxa" w:w="100"/>
+              <w:bottom w:type="dxa" w:w="60"/>
+              <w:right w:type="dxa" w:w="100"/>
+            </w:tcMar>
+          </w:tcPr>
+          <w:p>
+            <w:pPr>
+              <w:spacing w:after="0" w:line="252"/>
+            </w:pPr>
+            <w:r>
+              <w:rPr>
+                <w:rFonts w:ascii="Arial" w:cs="Arial" w:eastAsia="Arial" w:hAnsi="Arial"/>
+                <w:sz w:val="18"/>
+                <w:szCs w:val="18"/>
+              </w:rPr>
+              <w:t xml:space="preserve">Hausa</w:t>
+            </w:r>
+          </w:p>
+        </w:tc>
+        <w:tc>
+          <w:tcPr>
+            <w:tcW w:type="dxa" w:w="2060"/>
+            <w:tcBorders>
+              <w:top w:val="single" w:color="D9DDE8" w:sz="4"/>
+              <w:left w:val="single" w:color="D9DDE8" w:sz="4"/>
+              <w:bottom w:val="single" w:color="D9DDE8" w:sz="4"/>
+              <w:right w:val="single" w:color="D9DDE8" w:sz="4"/>
+            </w:tcBorders>
+            <w:tcMar>
+              <w:top w:type="dxa" w:w="60"/>
+              <w:left w:type="dxa" w:w="100"/>
+              <w:bottom w:type="dxa" w:w="60"/>
+              <w:right w:type="dxa" w:w="100"/>
+            </w:tcMar>
+          </w:tcPr>
+          <w:p>
+            <w:pPr>
+              <w:spacing w:after="0" w:line="252"/>
+            </w:pPr>
+            <w:r>
+              <w:rPr>
+                <w:rFonts w:ascii="Arial" w:cs="Arial" w:eastAsia="Arial" w:hAnsi="Arial"/>
+                <w:sz w:val="18"/>
+                <w:szCs w:val="18"/>
+              </w:rPr>
+              <w:t xml:space="preserve">88%</w:t>
+            </w:r>
+          </w:p>
+        </w:tc>
+        <w:tc>
+          <w:tcPr>
+            <w:tcW w:type="dxa" w:w="3190"/>
+            <w:tcBorders>
+              <w:top w:val="single" w:color="D9DDE8" w:sz="4"/>
+              <w:left w:val="single" w:color="D9DDE8" w:sz="4"/>
+              <w:bottom w:val="single" w:color="D9DDE8" w:sz="4"/>
+              <w:right w:val="single" w:color="D9DDE8" w:sz="4"/>
+            </w:tcBorders>
+            <w:tcMar>
+              <w:top w:type="dxa" w:w="60"/>
+              <w:left w:type="dxa" w:w="100"/>
+              <w:bottom w:type="dxa" w:w="60"/>
+              <w:right w:type="dxa" w:w="100"/>
+            </w:tcMar>
+          </w:tcPr>
+          <w:p>
+            <w:pPr>
+              <w:spacing w:after="0" w:line="252"/>
+            </w:pPr>
+            <w:r>
+              <w:rPr>
+                <w:rFonts w:ascii="Arial" w:cs="Arial" w:eastAsia="Arial" w:hAnsi="Arial"/>
+                <w:sz w:val="18"/>
+                <w:szCs w:val="18"/>
+              </w:rPr>
+              <w:t xml:space="preserve">82%</w:t>
+            </w:r>
+          </w:p>
+        </w:tc>
+        <w:tc>
+          <w:tcPr>
+            <w:tcW w:type="dxa" w:w="2860"/>
+            <w:tcBorders>
+              <w:top w:val="single" w:color="D9DDE8" w:sz="4"/>
+              <w:left w:val="single" w:color="D9DDE8" w:sz="4"/>
+              <w:bottom w:val="single" w:color="D9DDE8" w:sz="4"/>
+              <w:right w:val="single" w:color="D9DDE8" w:sz="4"/>
+            </w:tcBorders>
+            <w:tcMar>
+              <w:top w:type="dxa" w:w="60"/>
+              <w:left w:type="dxa" w:w="100"/>
+              <w:bottom w:type="dxa" w:w="60"/>
+              <w:right w:type="dxa" w:w="100"/>
+            </w:tcMar>
+          </w:tcPr>
+          <w:p>
+            <w:pPr>
+              <w:spacing w:after="0" w:line="252"/>
+            </w:pPr>
+            <w:r>
+              <w:rPr>
+                <w:rFonts w:ascii="Arial" w:cs="Arial" w:eastAsia="Arial" w:hAnsi="Arial"/>
+                <w:sz w:val="18"/>
+                <w:szCs w:val="18"/>
+              </w:rPr>
+              <w:t xml:space="preserve">82% (77%)</w:t>
+            </w:r>
+          </w:p>
+        </w:tc>
+      </w:tr>
+      <w:tr>
+        <w:trPr>
+          <w:tblHeader w:val="off"/>
+        </w:trPr>
+        <w:tc>
+          <w:tcPr>
+            <w:tcW w:type="dxa" w:w="1528"/>
+            <w:tcBorders>
+              <w:top w:val="single" w:color="D9DDE8" w:sz="4"/>
+              <w:left w:val="single" w:color="D9DDE8" w:sz="4"/>
+              <w:bottom w:val="single" w:color="D9DDE8" w:sz="4"/>
+              <w:right w:val="single" w:color="D9DDE8" w:sz="4"/>
+            </w:tcBorders>
+            <w:shd w:fill="F1F2F7" w:color="auto" w:val="clear"/>
+            <w:tcMar>
+              <w:top w:type="dxa" w:w="60"/>
+              <w:left w:type="dxa" w:w="100"/>
+              <w:bottom w:type="dxa" w:w="60"/>
+              <w:right w:type="dxa" w:w="100"/>
+            </w:tcMar>
+          </w:tcPr>
+          <w:p>
+            <w:pPr>
+              <w:spacing w:after="0" w:line="252"/>
+            </w:pPr>
+            <w:r>
+              <w:rPr>
+                <w:rFonts w:ascii="Arial" w:cs="Arial" w:eastAsia="Arial" w:hAnsi="Arial"/>
+                <w:sz w:val="18"/>
+                <w:szCs w:val="18"/>
+              </w:rPr>
+              <w:t xml:space="preserve">Yoruba</w:t>
+            </w:r>
+          </w:p>
+        </w:tc>
+        <w:tc>
+          <w:tcPr>
+            <w:tcW w:type="dxa" w:w="2060"/>
+            <w:tcBorders>
+              <w:top w:val="single" w:color="D9DDE8" w:sz="4"/>
+              <w:left w:val="single" w:color="D9DDE8" w:sz="4"/>
+              <w:bottom w:val="single" w:color="D9DDE8" w:sz="4"/>
+              <w:right w:val="single" w:color="D9DDE8" w:sz="4"/>
+            </w:tcBorders>
+            <w:tcMar>
+              <w:top w:type="dxa" w:w="60"/>
+              <w:left w:type="dxa" w:w="100"/>
+              <w:bottom w:type="dxa" w:w="60"/>
+              <w:right w:type="dxa" w:w="100"/>
+            </w:tcMar>
+          </w:tcPr>
+          <w:p>
+            <w:pPr>
+              <w:spacing w:after="0" w:line="252"/>
+            </w:pPr>
+            <w:r>
+              <w:rPr>
+                <w:rFonts w:ascii="Arial" w:cs="Arial" w:eastAsia="Arial" w:hAnsi="Arial"/>
+                <w:sz w:val="18"/>
+                <w:szCs w:val="18"/>
+              </w:rPr>
+              <w:t xml:space="preserve">87%</w:t>
+            </w:r>
+          </w:p>
+        </w:tc>
+        <w:tc>
+          <w:tcPr>
+            <w:tcW w:type="dxa" w:w="3190"/>
+            <w:tcBorders>
+              <w:top w:val="single" w:color="D9DDE8" w:sz="4"/>
+              <w:left w:val="single" w:color="D9DDE8" w:sz="4"/>
+              <w:bottom w:val="single" w:color="D9DDE8" w:sz="4"/>
+              <w:right w:val="single" w:color="D9DDE8" w:sz="4"/>
+            </w:tcBorders>
+            <w:tcMar>
+              <w:top w:type="dxa" w:w="60"/>
+              <w:left w:type="dxa" w:w="100"/>
+              <w:bottom w:type="dxa" w:w="60"/>
+              <w:right w:type="dxa" w:w="100"/>
+            </w:tcMar>
+          </w:tcPr>
+          <w:p>
+            <w:pPr>
+              <w:spacing w:after="0" w:line="252"/>
+            </w:pPr>
+            <w:r>
+              <w:rPr>
+                <w:rFonts w:ascii="Arial" w:cs="Arial" w:eastAsia="Arial" w:hAnsi="Arial"/>
+                <w:sz w:val="18"/>
+                <w:szCs w:val="18"/>
+              </w:rPr>
+              <w:t xml:space="preserve">73%</w:t>
+            </w:r>
+          </w:p>
+        </w:tc>
+        <w:tc>
+          <w:tcPr>
+            <w:tcW w:type="dxa" w:w="2860"/>
+            <w:tcBorders>
+              <w:top w:val="single" w:color="D9DDE8" w:sz="4"/>
+              <w:left w:val="single" w:color="D9DDE8" w:sz="4"/>
+              <w:bottom w:val="single" w:color="D9DDE8" w:sz="4"/>
+              <w:right w:val="single" w:color="D9DDE8" w:sz="4"/>
+            </w:tcBorders>
+            <w:tcMar>
+              <w:top w:type="dxa" w:w="60"/>
+              <w:left w:type="dxa" w:w="100"/>
+              <w:bottom w:type="dxa" w:w="60"/>
+              <w:right w:type="dxa" w:w="100"/>
+            </w:tcMar>
+          </w:tcPr>
+          <w:p>
+            <w:pPr>
+              <w:spacing w:after="0" w:line="252"/>
+            </w:pPr>
+            <w:r>
+              <w:rPr>
+                <w:rFonts w:ascii="Arial" w:cs="Arial" w:eastAsia="Arial" w:hAnsi="Arial"/>
+                <w:sz w:val="18"/>
+                <w:szCs w:val="18"/>
+              </w:rPr>
+              <w:t xml:space="preserve">86% (77%)</w:t>
+            </w:r>
+          </w:p>
+        </w:tc>
+      </w:tr>
+      <w:tr>
+        <w:trPr>
+          <w:tblHeader w:val="off"/>
+        </w:trPr>
+        <w:tc>
+          <w:tcPr>
+            <w:tcW w:type="dxa" w:w="1528"/>
+            <w:tcBorders>
+              <w:top w:val="single" w:color="D9DDE8" w:sz="4"/>
+              <w:left w:val="single" w:color="D9DDE8" w:sz="4"/>
+              <w:bottom w:val="single" w:color="D9DDE8" w:sz="4"/>
+              <w:right w:val="single" w:color="D9DDE8" w:sz="4"/>
+            </w:tcBorders>
+            <w:shd w:fill="F1F2F7" w:color="auto" w:val="clear"/>
+            <w:tcMar>
+              <w:top w:type="dxa" w:w="60"/>
+              <w:left w:type="dxa" w:w="100"/>
+              <w:bottom w:type="dxa" w:w="60"/>
+              <w:right w:type="dxa" w:w="100"/>
+            </w:tcMar>
+          </w:tcPr>
+          <w:p>
+            <w:pPr>
+              <w:spacing w:after="0" w:line="252"/>
+            </w:pPr>
+            <w:r>
+              <w:rPr>
+                <w:rFonts w:ascii="Arial" w:cs="Arial" w:eastAsia="Arial" w:hAnsi="Arial"/>
+                <w:sz w:val="18"/>
+                <w:szCs w:val="18"/>
+              </w:rPr>
+              <w:t xml:space="preserve">Igbo</w:t>
+            </w:r>
+          </w:p>
+        </w:tc>
+        <w:tc>
+          <w:tcPr>
+            <w:tcW w:type="dxa" w:w="2060"/>
+            <w:tcBorders>
+              <w:top w:val="single" w:color="D9DDE8" w:sz="4"/>
+              <w:left w:val="single" w:color="D9DDE8" w:sz="4"/>
+              <w:bottom w:val="single" w:color="D9DDE8" w:sz="4"/>
+              <w:right w:val="single" w:color="D9DDE8" w:sz="4"/>
+            </w:tcBorders>
+            <w:tcMar>
+              <w:top w:type="dxa" w:w="60"/>
+              <w:left w:type="dxa" w:w="100"/>
+              <w:bottom w:type="dxa" w:w="60"/>
+              <w:right w:type="dxa" w:w="100"/>
+            </w:tcMar>
+          </w:tcPr>
+          <w:p>
+            <w:pPr>
+              <w:spacing w:after="0" w:line="252"/>
+            </w:pPr>
+            <w:r>
+              <w:rPr>
+                <w:rFonts w:ascii="Arial" w:cs="Arial" w:eastAsia="Arial" w:hAnsi="Arial"/>
+                <w:sz w:val="18"/>
+                <w:szCs w:val="18"/>
+              </w:rPr>
+              <w:t xml:space="preserve">83%</w:t>
+            </w:r>
+          </w:p>
+        </w:tc>
+        <w:tc>
+          <w:tcPr>
+            <w:tcW w:type="dxa" w:w="3190"/>
+            <w:tcBorders>
+              <w:top w:val="single" w:color="D9DDE8" w:sz="4"/>
+              <w:left w:val="single" w:color="D9DDE8" w:sz="4"/>
+              <w:bottom w:val="single" w:color="D9DDE8" w:sz="4"/>
+              <w:right w:val="single" w:color="D9DDE8" w:sz="4"/>
+            </w:tcBorders>
+            <w:tcMar>
+              <w:top w:type="dxa" w:w="60"/>
+              <w:left w:type="dxa" w:w="100"/>
+              <w:bottom w:type="dxa" w:w="60"/>
+              <w:right w:type="dxa" w:w="100"/>
+            </w:tcMar>
+          </w:tcPr>
+          <w:p>
+            <w:pPr>
+              <w:spacing w:after="0" w:line="252"/>
+            </w:pPr>
+            <w:r>
+              <w:rPr>
+                <w:rFonts w:ascii="Arial" w:cs="Arial" w:eastAsia="Arial" w:hAnsi="Arial"/>
+                <w:sz w:val="18"/>
+                <w:szCs w:val="18"/>
+              </w:rPr>
+              <w:t xml:space="preserve">63%</w:t>
+            </w:r>
+          </w:p>
+        </w:tc>
+        <w:tc>
+          <w:tcPr>
+            <w:tcW w:type="dxa" w:w="2860"/>
+            <w:tcBorders>
+              <w:top w:val="single" w:color="D9DDE8" w:sz="4"/>
+              <w:left w:val="single" w:color="D9DDE8" w:sz="4"/>
+              <w:bottom w:val="single" w:color="D9DDE8" w:sz="4"/>
+              <w:right w:val="single" w:color="D9DDE8" w:sz="4"/>
+            </w:tcBorders>
+            <w:tcMar>
+              <w:top w:type="dxa" w:w="60"/>
+              <w:left w:type="dxa" w:w="100"/>
+              <w:bottom w:type="dxa" w:w="60"/>
+              <w:right w:type="dxa" w:w="100"/>
+            </w:tcMar>
+          </w:tcPr>
+          <w:p>
+            <w:pPr>
+              <w:spacing w:after="0" w:line="252"/>
+            </w:pPr>
+            <w:r>
+              <w:rPr>
+                <w:rFonts w:ascii="Arial" w:cs="Arial" w:eastAsia="Arial" w:hAnsi="Arial"/>
+                <w:sz w:val="18"/>
+                <w:szCs w:val="18"/>
+              </w:rPr>
+              <w:t xml:space="preserve">75% (68%)</w:t>
+            </w:r>
+          </w:p>
+        </w:tc>
+      </w:tr>
+      <w:tr>
+        <w:trPr>
+          <w:tblHeader w:val="off"/>
+        </w:trPr>
+        <w:tc>
+          <w:tcPr>
+            <w:tcW w:type="dxa" w:w="1528"/>
+            <w:tcBorders>
+              <w:top w:val="single" w:color="D9DDE8" w:sz="4"/>
+              <w:left w:val="single" w:color="D9DDE8" w:sz="4"/>
+              <w:bottom w:val="single" w:color="D9DDE8" w:sz="4"/>
+              <w:right w:val="single" w:color="D9DDE8" w:sz="4"/>
+            </w:tcBorders>
+            <w:shd w:fill="F1F2F7" w:color="auto" w:val="clear"/>
+            <w:tcMar>
+              <w:top w:type="dxa" w:w="60"/>
+              <w:left w:type="dxa" w:w="100"/>
+              <w:bottom w:type="dxa" w:w="60"/>
+              <w:right w:type="dxa" w:w="100"/>
+            </w:tcMar>
+          </w:tcPr>
+          <w:p>
+            <w:pPr>
+              <w:spacing w:after="0" w:line="252"/>
+            </w:pPr>
+            <w:r>
+              <w:rPr>
+                <w:rFonts w:ascii="Arial" w:cs="Arial" w:eastAsia="Arial" w:hAnsi="Arial"/>
+                <w:sz w:val="18"/>
+                <w:szCs w:val="18"/>
+              </w:rPr>
+              <w:t xml:space="preserve">All languages</w:t>
+            </w:r>
+          </w:p>
+        </w:tc>
+        <w:tc>
+          <w:tcPr>
+            <w:tcW w:type="dxa" w:w="2060"/>
+            <w:tcBorders>
+              <w:top w:val="single" w:color="D9DDE8" w:sz="4"/>
+              <w:left w:val="single" w:color="D9DDE8" w:sz="4"/>
+              <w:bottom w:val="single" w:color="D9DDE8" w:sz="4"/>
+              <w:right w:val="single" w:color="D9DDE8" w:sz="4"/>
+            </w:tcBorders>
+            <w:tcMar>
+              <w:top w:type="dxa" w:w="60"/>
+              <w:left w:type="dxa" w:w="100"/>
+              <w:bottom w:type="dxa" w:w="60"/>
+              <w:right w:type="dxa" w:w="100"/>
+            </w:tcMar>
+          </w:tcPr>
+          <w:p>
+            <w:pPr>
+              <w:spacing w:after="0" w:line="252"/>
+            </w:pPr>
+            <w:r>
+              <w:rPr>
+                <w:rFonts w:ascii="Arial" w:cs="Arial" w:eastAsia="Arial" w:hAnsi="Arial"/>
+                <w:sz w:val="18"/>
+                <w:szCs w:val="18"/>
+              </w:rPr>
+              <w:t xml:space="preserve">89%</w:t>
+            </w:r>
+          </w:p>
+        </w:tc>
+        <w:tc>
+          <w:tcPr>
+            <w:tcW w:type="dxa" w:w="3190"/>
+            <w:tcBorders>
+              <w:top w:val="single" w:color="D9DDE8" w:sz="4"/>
+              <w:left w:val="single" w:color="D9DDE8" w:sz="4"/>
+              <w:bottom w:val="single" w:color="D9DDE8" w:sz="4"/>
+              <w:right w:val="single" w:color="D9DDE8" w:sz="4"/>
+            </w:tcBorders>
+            <w:tcMar>
+              <w:top w:type="dxa" w:w="60"/>
+              <w:left w:type="dxa" w:w="100"/>
+              <w:bottom w:type="dxa" w:w="60"/>
+              <w:right w:type="dxa" w:w="100"/>
+            </w:tcMar>
+          </w:tcPr>
+          <w:p>
+            <w:pPr>
+              <w:spacing w:after="0" w:line="252"/>
+            </w:pPr>
+            <w:r>
+              <w:rPr>
+                <w:rFonts w:ascii="Arial" w:cs="Arial" w:eastAsia="Arial" w:hAnsi="Arial"/>
+                <w:sz w:val="18"/>
+                <w:szCs w:val="18"/>
+              </w:rPr>
+              <w:t xml:space="preserve">75%</w:t>
+            </w:r>
+          </w:p>
+        </w:tc>
+        <w:tc>
+          <w:tcPr>
+            <w:tcW w:type="dxa" w:w="2860"/>
+            <w:tcBorders>
+              <w:top w:val="single" w:color="D9DDE8" w:sz="4"/>
+              <w:left w:val="single" w:color="D9DDE8" w:sz="4"/>
+              <w:bottom w:val="single" w:color="D9DDE8" w:sz="4"/>
+              <w:right w:val="single" w:color="D9DDE8" w:sz="4"/>
+            </w:tcBorders>
+            <w:tcMar>
+              <w:top w:type="dxa" w:w="60"/>
+              <w:left w:type="dxa" w:w="100"/>
+              <w:bottom w:type="dxa" w:w="60"/>
+              <w:right w:type="dxa" w:w="100"/>
+            </w:tcMar>
+          </w:tcPr>
+          <w:p>
+            <w:pPr>
+              <w:spacing w:after="0" w:line="252"/>
+            </w:pPr>
+            <w:r>
+              <w:rPr>
+                <w:rFonts w:ascii="Arial" w:cs="Arial" w:eastAsia="Arial" w:hAnsi="Arial"/>
+                <w:sz w:val="18"/>
+                <w:szCs w:val="18"/>
+              </w:rPr>
+              <w:t xml:space="preserve">91% (88%)</w:t>
+            </w:r>
+          </w:p>
+        </w:tc>
+      </w:tr>
+    </w:tbl>
+    <w:p>
+      <w:pPr>
+        <w:spacing w:after="120"/>
+      </w:pPr>
+    </w:p>
+    <w:p>
+      <w:pPr>
+        <w:spacing w:after="120" w:line="288"/>
+      </w:pPr>
+      <w:r>
+        <w:rPr>
+          <w:rFonts w:ascii="Arial" w:cs="Arial" w:eastAsia="Arial" w:hAnsi="Arial"/>
+        </w:rPr>
+        <w:t xml:space="preserve">Sample: 300 complaints, 60 per language. Rewritten complaints are a harder, freer test (and a lower bound, since a rewrite can drift from the original meaning). N-ATLaS read all 27,511 distinct redacted complaints at 10.0 per second on one A100.</w:t>
+      </w:r>
+    </w:p>
+    <w:p>
+      <w:pPr>
+        <w:spacing w:after="120" w:line="288"/>
+      </w:pPr>
+      <w:r>
+        <w:rPr>
+          <w:rFonts w:ascii="Arial" w:cs="Arial" w:eastAsia="Arial" w:hAnsi="Arial"/>
+          <w:b/>
+          <w:bCs/>
+        </w:rPr>
+        <w:t xml:space="preserve">N-ATLaS briefs.</w:t>
+      </w:r>
+      <w:r>
+        <w:rPr>
+          <w:rFonts w:ascii="Arial" w:cs="Arial" w:eastAsia="Arial" w:hAnsi="Arial"/>
+        </w:rPr>
+        <w:t xml:space="preserve"> 7 of the 8 incident briefs passed automatic verification of every number against the evidence. The 8th repeatedly wrote the money at stake ten times too small and was </w:t>
+      </w:r>
+      <w:r>
+        <w:rPr>
+          <w:rFonts w:ascii="Arial" w:cs="Arial" w:eastAsia="Arial" w:hAnsi="Arial"/>
+          <w:b/>
+          <w:bCs/>
+        </w:rPr>
+        <w:t xml:space="preserve">held for analyst review</w:t>
+      </w:r>
+      <w:r>
+        <w:rPr>
+          <w:rFonts w:ascii="Arial" w:cs="Arial" w:eastAsia="Arial" w:hAnsi="Arial"/>
+        </w:rPr>
+        <w:t xml:space="preserve">, which is exactly what the verifier is for: an 8-billion-parameter model will occasionally get a number wrong, and the bank must never send that number to an owner or a customer unchecked.</w:t>
+      </w:r>
+    </w:p>
+    <w:p>
+      <w:pPr>
+        <w:spacing w:after="120" w:line="288"/>
+      </w:pPr>
+      <w:r>
+        <w:rPr>
+          <w:rFonts w:ascii="Arial" w:cs="Arial" w:eastAsia="Arial" w:hAnsi="Arial"/>
+          <w:b/>
+          <w:bCs/>
+        </w:rPr>
+        <w:t xml:space="preserve">What we learned about local languages.</w:t>
+      </w:r>
+      <w:r>
+        <w:rPr>
+          <w:rFonts w:ascii="Arial" w:cs="Arial" w:eastAsia="Arial" w:hAnsi="Arial"/>
+        </w:rPr>
+        <w:t xml:space="preserve"> N-ATLaS understands </w:t>
+      </w:r>
+      <w:r>
+        <w:rPr>
+          <w:rFonts w:ascii="Arial" w:cs="Arial" w:eastAsia="Arial" w:hAnsi="Arial"/>
+          <w:i/>
+          <w:iCs/>
+        </w:rPr>
+        <w:t xml:space="preserve">what</w:t>
+      </w:r>
+      <w:r>
+        <w:rPr>
+          <w:rFonts w:ascii="Arial" w:cs="Arial" w:eastAsia="Arial" w:hAnsi="Arial"/>
+        </w:rPr>
+        <w:t xml:space="preserve"> customers complain about in every language (issue accuracy 75–97% across all 249,553 complaints, with zero unparseable outputs). Three limits are worth stating: it is not trained on </w:t>
+      </w:r>
+      <w:r>
+        <w:rPr>
+          <w:rFonts w:ascii="Arial" w:cs="Arial" w:eastAsia="Arial" w:hAnsi="Arial"/>
+          <w:b/>
+          <w:bCs/>
+        </w:rPr>
+        <w:t xml:space="preserve">Nigerian Pidgin</w:t>
+      </w:r>
+      <w:r>
+        <w:rPr>
+          <w:rFonts w:ascii="Arial" w:cs="Arial" w:eastAsia="Arial" w:hAnsi="Arial"/>
+        </w:rPr>
+        <w:t xml:space="preserve">, and its Pidgin customer messages were unusable, so Pidgin speakers receive simple English messages; it cannot reliably tell </w:t>
+      </w:r>
+      <w:r>
+        <w:rPr>
+          <w:rFonts w:ascii="Arial" w:cs="Arial" w:eastAsia="Arial" w:hAnsi="Arial"/>
+          <w:i/>
+          <w:iCs/>
+        </w:rPr>
+        <w:t xml:space="preserve">which</w:t>
+      </w:r>
+      <w:r>
+        <w:rPr>
+          <w:rFonts w:ascii="Arial" w:cs="Arial" w:eastAsia="Arial" w:hAnsi="Arial"/>
+        </w:rPr>
+        <w:t xml:space="preserve"> language a complaint is in (Igbo and Pidgin were mostly labelled Yoruba), so the reply language should come from the customer's profile or a dedicated language-ID model, not from the LLM; and Yoruba and Igbo messages must be checked by native speakers, which the approval step provides.</w:t>
       </w:r>
     </w:p>
     <w:p>
@@ -2642,6 +4345,136 @@
           <w:rFonts w:ascii="Arial" w:cs="Arial" w:eastAsia="Arial" w:hAnsi="Arial"/>
         </w:rPr>
         <w:t xml:space="preserve"> The full pipeline runs end to end in our prototype on an A100: generator, redaction, N-ATLaS and BGE-M3 served on-premises with llama.cpp, the three CUDA kernels with CPU reference implementations, detection, evaluation, and a live console that replays the complaint stream and writes briefs on demand.</w:t>
+      </w:r>
+    </w:p>
+    <w:p>
+      <w:pPr>
+        <w:keepNext/>
+        <w:keepLines/>
+        <w:spacing w:after="60" w:before="120"/>
+        <w:jc w:val="center"/>
+      </w:pPr>
+      <w:r>
+        <w:drawing>
+          <wp:inline distT="0" distB="0" distL="0" distR="0">
+            <wp:extent cx="6096000" cy="3629025"/>
+            <wp:effectExtent t="0" r="0" b="0" l="0"/>
+            <wp:docPr id="4" name="console.png" descr="Figure 4. ComplaintPulse live console on the A100: issue radar, volume, multilingual feed." title="Figure 4. ComplaintPulse live console on the A100: issue radar, volume, multilingual feed."/>
+            <wp:cNvGraphicFramePr>
+              <a:graphicFrameLocks xmlns:a="http://schemas.openxmlformats.org/drawingml/2006/main" noChangeAspect="1"/>
+            </wp:cNvGraphicFramePr>
+            <a:graphic xmlns:a="http://schemas.openxmlformats.org/drawingml/2006/main">
+              <a:graphicData uri="http://schemas.openxmlformats.org/drawingml/2006/picture">
+                <pic:pic xmlns:pic="http://schemas.openxmlformats.org/drawingml/2006/picture">
+                  <pic:nvPicPr>
+                    <pic:cNvPr id="0" name="" descr=""/>
+                    <pic:cNvPicPr>
+                      <a:picLocks noChangeAspect="1" noChangeArrowheads="1"/>
+                    </pic:cNvPicPr>
+                  </pic:nvPicPr>
+                  <pic:blipFill>
+                    <a:blip r:embed="rId16" cstate="none"/>
+                    <a:srcRect/>
+                    <a:stretch>
+                      <a:fillRect/>
+                    </a:stretch>
+                  </pic:blipFill>
+                  <pic:spPr bwMode="auto">
+                    <a:xfrm>
+                      <a:off x="0" y="0"/>
+                      <a:ext cx="6096000" cy="3629025"/>
+                    </a:xfrm>
+                    <a:prstGeom prst="rect">
+                      <a:avLst/>
+                    </a:prstGeom>
+                  </pic:spPr>
+                </pic:pic>
+              </a:graphicData>
+            </a:graphic>
+          </wp:inline>
+        </w:drawing>
+      </w:r>
+    </w:p>
+    <w:p>
+      <w:pPr>
+        <w:spacing w:after="200"/>
+        <w:jc w:val="center"/>
+      </w:pPr>
+      <w:r>
+        <w:rPr>
+          <w:rFonts w:ascii="Arial" w:cs="Arial" w:eastAsia="Arial" w:hAnsi="Arial"/>
+          <w:i/>
+          <w:iCs/>
+          <w:color w:val="58637A"/>
+          <w:sz w:val="18"/>
+          <w:szCs w:val="18"/>
+        </w:rPr>
+        <w:t xml:space="preserve">Figure 4. ComplaintPulse live console on the A100: issue radar, volume, multilingual feed.</w:t>
+      </w:r>
+    </w:p>
+    <w:p>
+      <w:pPr>
+        <w:keepNext/>
+        <w:keepLines/>
+        <w:spacing w:after="60" w:before="120"/>
+        <w:jc w:val="center"/>
+      </w:pPr>
+      <w:r>
+        <w:drawing>
+          <wp:inline distT="0" distB="0" distL="0" distR="0">
+            <wp:extent cx="6096000" cy="2609850"/>
+            <wp:effectExtent t="0" r="0" b="0" l="0"/>
+            <wp:docPr id="5" name="console_incident.png" descr="Figure 5. One incident: K2 root cause, linked operational event, routed owner, evidence, and the N-ATLaS brief that passed number verification." title="Figure 5. One incident: K2 root cause, linked operational event, routed owner, evidence, and the N-ATLaS brief that passed number verification."/>
+            <wp:cNvGraphicFramePr>
+              <a:graphicFrameLocks xmlns:a="http://schemas.openxmlformats.org/drawingml/2006/main" noChangeAspect="1"/>
+            </wp:cNvGraphicFramePr>
+            <a:graphic xmlns:a="http://schemas.openxmlformats.org/drawingml/2006/main">
+              <a:graphicData uri="http://schemas.openxmlformats.org/drawingml/2006/picture">
+                <pic:pic xmlns:pic="http://schemas.openxmlformats.org/drawingml/2006/picture">
+                  <pic:nvPicPr>
+                    <pic:cNvPr id="0" name="" descr=""/>
+                    <pic:cNvPicPr>
+                      <a:picLocks noChangeAspect="1" noChangeArrowheads="1"/>
+                    </pic:cNvPicPr>
+                  </pic:nvPicPr>
+                  <pic:blipFill>
+                    <a:blip r:embed="rId17" cstate="none"/>
+                    <a:srcRect/>
+                    <a:stretch>
+                      <a:fillRect/>
+                    </a:stretch>
+                  </pic:blipFill>
+                  <pic:spPr bwMode="auto">
+                    <a:xfrm>
+                      <a:off x="0" y="0"/>
+                      <a:ext cx="6096000" cy="2609850"/>
+                    </a:xfrm>
+                    <a:prstGeom prst="rect">
+                      <a:avLst/>
+                    </a:prstGeom>
+                  </pic:spPr>
+                </pic:pic>
+              </a:graphicData>
+            </a:graphic>
+          </wp:inline>
+        </w:drawing>
+      </w:r>
+    </w:p>
+    <w:p>
+      <w:pPr>
+        <w:spacing w:after="200"/>
+        <w:jc w:val="center"/>
+      </w:pPr>
+      <w:r>
+        <w:rPr>
+          <w:rFonts w:ascii="Arial" w:cs="Arial" w:eastAsia="Arial" w:hAnsi="Arial"/>
+          <w:i/>
+          <w:iCs/>
+          <w:color w:val="58637A"/>
+          <w:sz w:val="18"/>
+          <w:szCs w:val="18"/>
+        </w:rPr>
+        <w:t xml:space="preserve">Figure 5. One incident: K2 root cause, linked operational event, routed owner, evidence, and the N-ATLaS brief that passed number verification.</w:t>
       </w:r>
     </w:p>
     <w:p>
@@ -3241,7 +5074,7 @@
         </w:rPr>
         <w:t xml:space="preserve">CBN complaints and fines 2024–2025: </w:t>
       </w:r>
-      <w:hyperlink w:history="1" r:id="rIdjlxwwdxxjtpe_5urjth4d">
+      <w:hyperlink w:history="1" r:id="rIddj2xynd4syy5pnvjys3kw">
         <w:r>
           <w:rPr>
             <w:rFonts w:ascii="Arial" w:cs="Arial" w:eastAsia="Arial" w:hAnsi="Arial"/>
@@ -3257,7 +5090,7 @@
         </w:rPr>
         <w:t xml:space="preserve">, </w:t>
       </w:r>
-      <w:hyperlink w:history="1" r:id="rIdk-8gpb9i4snx09w1pltvb">
+      <w:hyperlink w:history="1" r:id="rId0n9rbyvivqoujvxv5oepg">
         <w:r>
           <w:rPr>
             <w:rFonts w:ascii="Arial" w:cs="Arial" w:eastAsia="Arial" w:hAnsi="Arial"/>
@@ -3283,7 +5116,7 @@
         </w:rPr>
         <w:t xml:space="preserve">Failed-transaction refunds over 10 years: </w:t>
       </w:r>
-      <w:hyperlink w:history="1" r:id="rIdjkzpvtinwkdmhxlcr5rlz">
+      <w:hyperlink w:history="1" r:id="rId3dzvhdzo-nzmnpcqdh4af">
         <w:r>
           <w:rPr>
             <w:rFonts w:ascii="Arial" w:cs="Arial" w:eastAsia="Arial" w:hAnsi="Arial"/>
@@ -3309,7 +5142,7 @@
         </w:rPr>
         <w:t xml:space="preserve">N-ATLaS model card and terms: </w:t>
       </w:r>
-      <w:hyperlink w:history="1" r:id="rIdbnr8rsyfmdez32zugipug">
+      <w:hyperlink w:history="1" r:id="rId9mmmvw37mt111wsijyjur">
         <w:r>
           <w:rPr>
             <w:rFonts w:ascii="Arial" w:cs="Arial" w:eastAsia="Arial" w:hAnsi="Arial"/>

</xml_diff>